<commit_message>
parte 2 do tbl1
</commit_message>
<xml_diff>
--- a/tbl1/grupo/tbl1AtividadeGrupo.docx
+++ b/tbl1/grupo/tbl1AtividadeGrupo.docx
@@ -129,7 +129,344 @@
           <w:b w:val="false"/>
           <w:bCs w:val="false"/>
         </w:rPr>
-        <w:t xml:space="preserve">1° - </w:t>
+        <w:tab/>
+        <w:t xml:space="preserve">Bloco 1 </w:t>
+      </w:r>
+    </w:p>
+    <w:p>
+      <w:pPr>
+        <w:pStyle w:val="Normal"/>
+        <w:numPr>
+          <w:ilvl w:val="0"/>
+          <w:numId w:val="1"/>
+        </w:numPr>
+        <w:bidi w:val="0"/>
+        <w:jc w:val="start"/>
+        <w:rPr/>
+      </w:pPr>
+      <w:r>
+        <w:rPr/>
+        <w:t>Os htmls não carregaram as mesmas classes, o meu projeto utilizou apenas duas classes para selecionar a divisão principal e o item destaque da fila. Alerrandro utilizou classes para os elementos principais da página, títulos, divs e o botão.</w:t>
+      </w:r>
+    </w:p>
+    <w:p>
+      <w:pPr>
+        <w:pStyle w:val="Normal"/>
+        <w:numPr>
+          <w:ilvl w:val="0"/>
+          <w:numId w:val="1"/>
+        </w:numPr>
+        <w:bidi w:val="0"/>
+        <w:jc w:val="start"/>
+        <w:rPr/>
+      </w:pPr>
+      <w:r>
+        <w:rPr/>
+        <w:t>Sim, Alerrandro utilizou mais classes para poder manipular elementos com mais exclusividade.</w:t>
+      </w:r>
+    </w:p>
+    <w:p>
+      <w:pPr>
+        <w:pStyle w:val="Normal"/>
+        <w:numPr>
+          <w:ilvl w:val="0"/>
+          <w:numId w:val="1"/>
+        </w:numPr>
+        <w:bidi w:val="0"/>
+        <w:jc w:val="start"/>
+        <w:rPr/>
+      </w:pPr>
+      <w:r>
+        <w:rPr/>
+        <w:t>Sim, ambos seguiram abordagens semelhantes na estruturação da página, as diferenças mais visíveis são a diferença de estilização e utilização de classes.</w:t>
+      </w:r>
+    </w:p>
+    <w:p>
+      <w:pPr>
+        <w:pStyle w:val="Normal"/>
+        <w:numPr>
+          <w:ilvl w:val="0"/>
+          <w:numId w:val="1"/>
+        </w:numPr>
+        <w:bidi w:val="0"/>
+        <w:jc w:val="start"/>
+        <w:rPr/>
+      </w:pPr>
+      <w:r>
+        <w:rPr/>
+        <w:t>Não foram utilizados ids pois havia uma restrição para não utilizar ids na construção do html.</w:t>
+      </w:r>
+    </w:p>
+    <w:p>
+      <w:pPr>
+        <w:pStyle w:val="Normal"/>
+        <w:bidi w:val="0"/>
+        <w:jc w:val="start"/>
+        <w:rPr/>
+      </w:pPr>
+      <w:r>
+        <w:rPr/>
+      </w:r>
+    </w:p>
+    <w:p>
+      <w:pPr>
+        <w:pStyle w:val="Normal"/>
+        <w:bidi w:val="0"/>
+        <w:jc w:val="start"/>
+        <w:rPr/>
+      </w:pPr>
+      <w:r>
+        <w:rPr/>
+      </w:r>
+    </w:p>
+    <w:p>
+      <w:pPr>
+        <w:pStyle w:val="Normal"/>
+        <w:bidi w:val="0"/>
+        <w:jc w:val="start"/>
+        <w:rPr/>
+      </w:pPr>
+      <w:r>
+        <w:rPr/>
+        <w:t>Bloco 2</w:t>
+      </w:r>
+    </w:p>
+    <w:p>
+      <w:pPr>
+        <w:pStyle w:val="Normal"/>
+        <w:numPr>
+          <w:ilvl w:val="0"/>
+          <w:numId w:val="2"/>
+        </w:numPr>
+        <w:bidi w:val="0"/>
+        <w:jc w:val="start"/>
+        <w:rPr/>
+      </w:pPr>
+      <w:r>
+        <w:rPr/>
+        <w:t>Eu utilizei o display flex, determinei o sentido do flex para coluna, ajustei o conteúdo e os itens dentro do cartão para centro. A outra página foi criada usando display grid e centralizou os itens no centro.</w:t>
+      </w:r>
+    </w:p>
+    <w:p>
+      <w:pPr>
+        <w:pStyle w:val="Normal"/>
+        <w:numPr>
+          <w:ilvl w:val="0"/>
+          <w:numId w:val="2"/>
+        </w:numPr>
+        <w:bidi w:val="0"/>
+        <w:jc w:val="start"/>
+        <w:rPr/>
+      </w:pPr>
+      <w:r>
+        <w:rPr/>
+        <w:t>Sim, tive dificuldades para fazer os itens aparecerem em ordem, pois sempre que usava apenas o justify-content com display flex, os itens e textos ficavam organizados horizontalmente e não seguia a formatação em colunas de itens, como se os itens se organizassem com uma linha horizontal.</w:t>
+      </w:r>
+    </w:p>
+    <w:p>
+      <w:pPr>
+        <w:pStyle w:val="Normal"/>
+        <w:numPr>
+          <w:ilvl w:val="0"/>
+          <w:numId w:val="2"/>
+        </w:numPr>
+        <w:bidi w:val="0"/>
+        <w:jc w:val="start"/>
+        <w:rPr/>
+      </w:pPr>
+      <w:r>
+        <w:rPr/>
+        <w:t>Utilizei margin no card e na lista, paddig usei nos elementos card e botão. O outro html usou margin no card, padding foi usado nos elementos botão, lista, card e título.</w:t>
+      </w:r>
+    </w:p>
+    <w:p>
+      <w:pPr>
+        <w:pStyle w:val="Normal"/>
+        <w:numPr>
+          <w:ilvl w:val="0"/>
+          <w:numId w:val="2"/>
+        </w:numPr>
+        <w:bidi w:val="0"/>
+        <w:jc w:val="start"/>
+        <w:rPr/>
+      </w:pPr>
+      <w:r>
+        <w:rPr/>
+        <w:t>Ambos concordamos que os elementos dentro do card ficam colados às bordas do card.</w:t>
+      </w:r>
+    </w:p>
+    <w:p>
+      <w:pPr>
+        <w:pStyle w:val="Normal"/>
+        <w:bidi w:val="0"/>
+        <w:jc w:val="start"/>
+        <w:rPr/>
+      </w:pPr>
+      <w:r>
+        <w:rPr/>
+      </w:r>
+    </w:p>
+    <w:p>
+      <w:pPr>
+        <w:pStyle w:val="Normal"/>
+        <w:bidi w:val="0"/>
+        <w:jc w:val="start"/>
+        <w:rPr/>
+      </w:pPr>
+      <w:r>
+        <w:rPr/>
+        <w:t>Bloco 3</w:t>
+      </w:r>
+    </w:p>
+    <w:p>
+      <w:pPr>
+        <w:pStyle w:val="Normal"/>
+        <w:numPr>
+          <w:ilvl w:val="0"/>
+          <w:numId w:val="3"/>
+        </w:numPr>
+        <w:bidi w:val="0"/>
+        <w:jc w:val="start"/>
+        <w:rPr/>
+      </w:pPr>
+      <w:r>
+        <w:rPr/>
+        <w:t>Cada um destacou botão colocando a cor de fundo na qual entrava em detrimento com o fundo do card, sendo assim o botão se destaca.</w:t>
+      </w:r>
+    </w:p>
+    <w:p>
+      <w:pPr>
+        <w:pStyle w:val="Normal"/>
+        <w:numPr>
+          <w:ilvl w:val="0"/>
+          <w:numId w:val="3"/>
+        </w:numPr>
+        <w:bidi w:val="0"/>
+        <w:jc w:val="start"/>
+        <w:rPr/>
+      </w:pPr>
+      <w:r>
+        <w:rPr/>
+        <w:t>Não foi aplicado da mesma maneira, eu marquei em negrito um item da lista de tópicos do curso usando negrito e sublinhei o item. O Alerrandro destacou o título do card mudando ele de cor.</w:t>
+      </w:r>
+    </w:p>
+    <w:p>
+      <w:pPr>
+        <w:pStyle w:val="Normal"/>
+        <w:numPr>
+          <w:ilvl w:val="0"/>
+          <w:numId w:val="3"/>
+        </w:numPr>
+        <w:bidi w:val="0"/>
+        <w:jc w:val="start"/>
+        <w:rPr/>
+      </w:pPr>
+      <w:r>
+        <w:rPr/>
+        <w:t>O meu título foi estilizando com um tom próximo do branco, marquei o peso do texto como bolder e mudei a família da fonte para ‘Gill Sans’. O Alerrandro manejou o destaque mudando a cor do título, isso foi feito para colocar o destaque em um local menos exigente de criatividade.</w:t>
+      </w:r>
+    </w:p>
+    <w:p>
+      <w:pPr>
+        <w:pStyle w:val="Normal"/>
+        <w:bidi w:val="0"/>
+        <w:jc w:val="start"/>
+        <w:rPr/>
+      </w:pPr>
+      <w:r>
+        <w:rPr/>
+      </w:r>
+    </w:p>
+    <w:p>
+      <w:pPr>
+        <w:pStyle w:val="Normal"/>
+        <w:bidi w:val="0"/>
+        <w:jc w:val="start"/>
+        <w:rPr/>
+      </w:pPr>
+      <w:r>
+        <w:rPr/>
+        <w:t>Bloco 4</w:t>
+      </w:r>
+    </w:p>
+    <w:p>
+      <w:pPr>
+        <w:pStyle w:val="Normal"/>
+        <w:numPr>
+          <w:ilvl w:val="0"/>
+          <w:numId w:val="4"/>
+        </w:numPr>
+        <w:bidi w:val="0"/>
+        <w:jc w:val="start"/>
+        <w:rPr/>
+      </w:pPr>
+      <w:r>
+        <w:rPr/>
+        <w:t>Ambos ficaram organizados à medida que foram feitos com princípios diferentes, o meu ficou mais enxuto devido ao uso de menos elementos e classes. Contudo, a outra página exigiu a criação de mais classes para manipulação de determinados elementos, por isso o html e css ficaram mais carregados.</w:t>
+      </w:r>
+    </w:p>
+    <w:p>
+      <w:pPr>
+        <w:pStyle w:val="Normal"/>
+        <w:numPr>
+          <w:ilvl w:val="0"/>
+          <w:numId w:val="4"/>
+        </w:numPr>
+        <w:bidi w:val="0"/>
+        <w:jc w:val="start"/>
+        <w:rPr/>
+      </w:pPr>
+      <w:r>
+        <w:rPr/>
+        <w:t>Como o outro projeto idealiza mais classes, uma nova página criada poderá reutilizar as mesmas classe da página criada previamente e assim herdar características sem a necessidade de gastar tempo com planejamento da estilização da página.</w:t>
+      </w:r>
+    </w:p>
+    <w:p>
+      <w:pPr>
+        <w:pStyle w:val="Normal"/>
+        <w:numPr>
+          <w:ilvl w:val="0"/>
+          <w:numId w:val="4"/>
+        </w:numPr>
+        <w:bidi w:val="0"/>
+        <w:jc w:val="start"/>
+        <w:rPr/>
+      </w:pPr>
+      <w:r>
+        <w:rPr/>
+        <w:t xml:space="preserve">Ambos tiveram dificuldades para centralizar os elementos do html. </w:t>
+      </w:r>
+    </w:p>
+    <w:p>
+      <w:pPr>
+        <w:pStyle w:val="Normal"/>
+        <w:numPr>
+          <w:ilvl w:val="0"/>
+          <w:numId w:val="4"/>
+        </w:numPr>
+        <w:bidi w:val="0"/>
+        <w:jc w:val="start"/>
+        <w:rPr/>
+      </w:pPr>
+      <w:r>
+        <w:rPr/>
+        <w:t>Utilizaria mais classes.</w:t>
+      </w:r>
+    </w:p>
+    <w:p>
+      <w:pPr>
+        <w:pStyle w:val="Normal"/>
+        <w:numPr>
+          <w:ilvl w:val="0"/>
+          <w:numId w:val="4"/>
+        </w:numPr>
+        <w:bidi w:val="0"/>
+        <w:jc w:val="start"/>
+        <w:rPr/>
+      </w:pPr>
+      <w:r>
+        <w:rPr/>
+        <w:t>Eu escolhi aumentar a largura do body para 700px. Alerrandro percebeu que existiram estilizações no título redundantes para centralização e as retirou.</w:t>
       </w:r>
     </w:p>
     <w:sectPr>
@@ -143,6 +480,621 @@
     </w:sectPr>
   </w:body>
 </w:document>
+</file>
+
+<file path=word/numbering.xml><?xml version="1.0" encoding="utf-8"?>
+<w:numbering xmlns:w="http://schemas.openxmlformats.org/wordprocessingml/2006/main" xmlns:o="urn:schemas-microsoft-com:office:office" xmlns:r="http://schemas.openxmlformats.org/officeDocument/2006/relationships" xmlns:v="urn:schemas-microsoft-com:vml" xmlns:mc="http://schemas.openxmlformats.org/markup-compatibility/2006" xmlns:w14="http://schemas.microsoft.com/office/word/2010/wordml" mc:Ignorable="w14">
+  <w:abstractNum w:abstractNumId="1">
+    <w:lvl w:ilvl="0">
+      <w:start w:val="1"/>
+      <w:numFmt w:val="decimal"/>
+      <w:lvlText w:val="%1."/>
+      <w:lvlJc w:val="start"/>
+      <w:pPr>
+        <w:tabs>
+          <w:tab w:val="num" w:pos="780"/>
+        </w:tabs>
+        <w:ind w:start="780" w:hanging="360"/>
+      </w:pPr>
+      <w:rPr/>
+    </w:lvl>
+    <w:lvl w:ilvl="1">
+      <w:start w:val="1"/>
+      <w:numFmt w:val="decimal"/>
+      <w:lvlText w:val="%2."/>
+      <w:lvlJc w:val="start"/>
+      <w:pPr>
+        <w:tabs>
+          <w:tab w:val="num" w:pos="1140"/>
+        </w:tabs>
+        <w:ind w:start="1140" w:hanging="360"/>
+      </w:pPr>
+      <w:rPr/>
+    </w:lvl>
+    <w:lvl w:ilvl="2">
+      <w:start w:val="1"/>
+      <w:numFmt w:val="decimal"/>
+      <w:lvlText w:val="%3."/>
+      <w:lvlJc w:val="start"/>
+      <w:pPr>
+        <w:tabs>
+          <w:tab w:val="num" w:pos="1500"/>
+        </w:tabs>
+        <w:ind w:start="1500" w:hanging="360"/>
+      </w:pPr>
+      <w:rPr/>
+    </w:lvl>
+    <w:lvl w:ilvl="3">
+      <w:start w:val="1"/>
+      <w:numFmt w:val="decimal"/>
+      <w:lvlText w:val="%4."/>
+      <w:lvlJc w:val="start"/>
+      <w:pPr>
+        <w:tabs>
+          <w:tab w:val="num" w:pos="1860"/>
+        </w:tabs>
+        <w:ind w:start="1860" w:hanging="360"/>
+      </w:pPr>
+      <w:rPr/>
+    </w:lvl>
+    <w:lvl w:ilvl="4">
+      <w:start w:val="1"/>
+      <w:numFmt w:val="decimal"/>
+      <w:lvlText w:val="%5."/>
+      <w:lvlJc w:val="start"/>
+      <w:pPr>
+        <w:tabs>
+          <w:tab w:val="num" w:pos="2220"/>
+        </w:tabs>
+        <w:ind w:start="2220" w:hanging="360"/>
+      </w:pPr>
+      <w:rPr/>
+    </w:lvl>
+    <w:lvl w:ilvl="5">
+      <w:start w:val="1"/>
+      <w:numFmt w:val="decimal"/>
+      <w:lvlText w:val="%6."/>
+      <w:lvlJc w:val="start"/>
+      <w:pPr>
+        <w:tabs>
+          <w:tab w:val="num" w:pos="2580"/>
+        </w:tabs>
+        <w:ind w:start="2580" w:hanging="360"/>
+      </w:pPr>
+      <w:rPr/>
+    </w:lvl>
+    <w:lvl w:ilvl="6">
+      <w:start w:val="1"/>
+      <w:numFmt w:val="decimal"/>
+      <w:lvlText w:val="%7."/>
+      <w:lvlJc w:val="start"/>
+      <w:pPr>
+        <w:tabs>
+          <w:tab w:val="num" w:pos="2940"/>
+        </w:tabs>
+        <w:ind w:start="2940" w:hanging="360"/>
+      </w:pPr>
+      <w:rPr/>
+    </w:lvl>
+    <w:lvl w:ilvl="7">
+      <w:start w:val="1"/>
+      <w:numFmt w:val="decimal"/>
+      <w:lvlText w:val="%8."/>
+      <w:lvlJc w:val="start"/>
+      <w:pPr>
+        <w:tabs>
+          <w:tab w:val="num" w:pos="3300"/>
+        </w:tabs>
+        <w:ind w:start="3300" w:hanging="360"/>
+      </w:pPr>
+      <w:rPr/>
+    </w:lvl>
+    <w:lvl w:ilvl="8">
+      <w:start w:val="1"/>
+      <w:numFmt w:val="decimal"/>
+      <w:lvlText w:val="%9."/>
+      <w:lvlJc w:val="start"/>
+      <w:pPr>
+        <w:tabs>
+          <w:tab w:val="num" w:pos="3660"/>
+        </w:tabs>
+        <w:ind w:start="3660" w:hanging="360"/>
+      </w:pPr>
+      <w:rPr/>
+    </w:lvl>
+  </w:abstractNum>
+  <w:abstractNum w:abstractNumId="2">
+    <w:lvl w:ilvl="0">
+      <w:start w:val="1"/>
+      <w:numFmt w:val="decimal"/>
+      <w:lvlText w:val="%1."/>
+      <w:lvlJc w:val="start"/>
+      <w:pPr>
+        <w:tabs>
+          <w:tab w:val="num" w:pos="720"/>
+        </w:tabs>
+        <w:ind w:start="720" w:hanging="360"/>
+      </w:pPr>
+      <w:rPr/>
+    </w:lvl>
+    <w:lvl w:ilvl="1">
+      <w:start w:val="1"/>
+      <w:numFmt w:val="decimal"/>
+      <w:lvlText w:val="%2."/>
+      <w:lvlJc w:val="start"/>
+      <w:pPr>
+        <w:tabs>
+          <w:tab w:val="num" w:pos="1080"/>
+        </w:tabs>
+        <w:ind w:start="1080" w:hanging="360"/>
+      </w:pPr>
+      <w:rPr/>
+    </w:lvl>
+    <w:lvl w:ilvl="2">
+      <w:start w:val="1"/>
+      <w:numFmt w:val="decimal"/>
+      <w:lvlText w:val="%3."/>
+      <w:lvlJc w:val="start"/>
+      <w:pPr>
+        <w:tabs>
+          <w:tab w:val="num" w:pos="1440"/>
+        </w:tabs>
+        <w:ind w:start="1440" w:hanging="360"/>
+      </w:pPr>
+      <w:rPr/>
+    </w:lvl>
+    <w:lvl w:ilvl="3">
+      <w:start w:val="1"/>
+      <w:numFmt w:val="decimal"/>
+      <w:lvlText w:val="%4."/>
+      <w:lvlJc w:val="start"/>
+      <w:pPr>
+        <w:tabs>
+          <w:tab w:val="num" w:pos="1800"/>
+        </w:tabs>
+        <w:ind w:start="1800" w:hanging="360"/>
+      </w:pPr>
+      <w:rPr/>
+    </w:lvl>
+    <w:lvl w:ilvl="4">
+      <w:start w:val="1"/>
+      <w:numFmt w:val="decimal"/>
+      <w:lvlText w:val="%5."/>
+      <w:lvlJc w:val="start"/>
+      <w:pPr>
+        <w:tabs>
+          <w:tab w:val="num" w:pos="2160"/>
+        </w:tabs>
+        <w:ind w:start="2160" w:hanging="360"/>
+      </w:pPr>
+      <w:rPr/>
+    </w:lvl>
+    <w:lvl w:ilvl="5">
+      <w:start w:val="1"/>
+      <w:numFmt w:val="decimal"/>
+      <w:lvlText w:val="%6."/>
+      <w:lvlJc w:val="start"/>
+      <w:pPr>
+        <w:tabs>
+          <w:tab w:val="num" w:pos="2520"/>
+        </w:tabs>
+        <w:ind w:start="2520" w:hanging="360"/>
+      </w:pPr>
+      <w:rPr/>
+    </w:lvl>
+    <w:lvl w:ilvl="6">
+      <w:start w:val="1"/>
+      <w:numFmt w:val="decimal"/>
+      <w:lvlText w:val="%7."/>
+      <w:lvlJc w:val="start"/>
+      <w:pPr>
+        <w:tabs>
+          <w:tab w:val="num" w:pos="2880"/>
+        </w:tabs>
+        <w:ind w:start="2880" w:hanging="360"/>
+      </w:pPr>
+      <w:rPr/>
+    </w:lvl>
+    <w:lvl w:ilvl="7">
+      <w:start w:val="1"/>
+      <w:numFmt w:val="decimal"/>
+      <w:lvlText w:val="%8."/>
+      <w:lvlJc w:val="start"/>
+      <w:pPr>
+        <w:tabs>
+          <w:tab w:val="num" w:pos="3240"/>
+        </w:tabs>
+        <w:ind w:start="3240" w:hanging="360"/>
+      </w:pPr>
+      <w:rPr/>
+    </w:lvl>
+    <w:lvl w:ilvl="8">
+      <w:start w:val="1"/>
+      <w:numFmt w:val="decimal"/>
+      <w:lvlText w:val="%9."/>
+      <w:lvlJc w:val="start"/>
+      <w:pPr>
+        <w:tabs>
+          <w:tab w:val="num" w:pos="3600"/>
+        </w:tabs>
+        <w:ind w:start="3600" w:hanging="360"/>
+      </w:pPr>
+      <w:rPr/>
+    </w:lvl>
+  </w:abstractNum>
+  <w:abstractNum w:abstractNumId="3">
+    <w:lvl w:ilvl="0">
+      <w:start w:val="1"/>
+      <w:numFmt w:val="decimal"/>
+      <w:lvlText w:val="%1."/>
+      <w:lvlJc w:val="start"/>
+      <w:pPr>
+        <w:tabs>
+          <w:tab w:val="num" w:pos="720"/>
+        </w:tabs>
+        <w:ind w:start="720" w:hanging="360"/>
+      </w:pPr>
+      <w:rPr/>
+    </w:lvl>
+    <w:lvl w:ilvl="1">
+      <w:start w:val="1"/>
+      <w:numFmt w:val="decimal"/>
+      <w:lvlText w:val="%2."/>
+      <w:lvlJc w:val="start"/>
+      <w:pPr>
+        <w:tabs>
+          <w:tab w:val="num" w:pos="1080"/>
+        </w:tabs>
+        <w:ind w:start="1080" w:hanging="360"/>
+      </w:pPr>
+      <w:rPr/>
+    </w:lvl>
+    <w:lvl w:ilvl="2">
+      <w:start w:val="1"/>
+      <w:numFmt w:val="decimal"/>
+      <w:lvlText w:val="%3."/>
+      <w:lvlJc w:val="start"/>
+      <w:pPr>
+        <w:tabs>
+          <w:tab w:val="num" w:pos="1440"/>
+        </w:tabs>
+        <w:ind w:start="1440" w:hanging="360"/>
+      </w:pPr>
+      <w:rPr/>
+    </w:lvl>
+    <w:lvl w:ilvl="3">
+      <w:start w:val="1"/>
+      <w:numFmt w:val="decimal"/>
+      <w:lvlText w:val="%4."/>
+      <w:lvlJc w:val="start"/>
+      <w:pPr>
+        <w:tabs>
+          <w:tab w:val="num" w:pos="1800"/>
+        </w:tabs>
+        <w:ind w:start="1800" w:hanging="360"/>
+      </w:pPr>
+      <w:rPr/>
+    </w:lvl>
+    <w:lvl w:ilvl="4">
+      <w:start w:val="1"/>
+      <w:numFmt w:val="decimal"/>
+      <w:lvlText w:val="%5."/>
+      <w:lvlJc w:val="start"/>
+      <w:pPr>
+        <w:tabs>
+          <w:tab w:val="num" w:pos="2160"/>
+        </w:tabs>
+        <w:ind w:start="2160" w:hanging="360"/>
+      </w:pPr>
+      <w:rPr/>
+    </w:lvl>
+    <w:lvl w:ilvl="5">
+      <w:start w:val="1"/>
+      <w:numFmt w:val="decimal"/>
+      <w:lvlText w:val="%6."/>
+      <w:lvlJc w:val="start"/>
+      <w:pPr>
+        <w:tabs>
+          <w:tab w:val="num" w:pos="2520"/>
+        </w:tabs>
+        <w:ind w:start="2520" w:hanging="360"/>
+      </w:pPr>
+      <w:rPr/>
+    </w:lvl>
+    <w:lvl w:ilvl="6">
+      <w:start w:val="1"/>
+      <w:numFmt w:val="decimal"/>
+      <w:lvlText w:val="%7."/>
+      <w:lvlJc w:val="start"/>
+      <w:pPr>
+        <w:tabs>
+          <w:tab w:val="num" w:pos="2880"/>
+        </w:tabs>
+        <w:ind w:start="2880" w:hanging="360"/>
+      </w:pPr>
+      <w:rPr/>
+    </w:lvl>
+    <w:lvl w:ilvl="7">
+      <w:start w:val="1"/>
+      <w:numFmt w:val="decimal"/>
+      <w:lvlText w:val="%8."/>
+      <w:lvlJc w:val="start"/>
+      <w:pPr>
+        <w:tabs>
+          <w:tab w:val="num" w:pos="3240"/>
+        </w:tabs>
+        <w:ind w:start="3240" w:hanging="360"/>
+      </w:pPr>
+      <w:rPr/>
+    </w:lvl>
+    <w:lvl w:ilvl="8">
+      <w:start w:val="1"/>
+      <w:numFmt w:val="decimal"/>
+      <w:lvlText w:val="%9."/>
+      <w:lvlJc w:val="start"/>
+      <w:pPr>
+        <w:tabs>
+          <w:tab w:val="num" w:pos="3600"/>
+        </w:tabs>
+        <w:ind w:start="3600" w:hanging="360"/>
+      </w:pPr>
+      <w:rPr/>
+    </w:lvl>
+  </w:abstractNum>
+  <w:abstractNum w:abstractNumId="4">
+    <w:lvl w:ilvl="0">
+      <w:start w:val="1"/>
+      <w:numFmt w:val="decimal"/>
+      <w:lvlText w:val="%1."/>
+      <w:lvlJc w:val="start"/>
+      <w:pPr>
+        <w:tabs>
+          <w:tab w:val="num" w:pos="720"/>
+        </w:tabs>
+        <w:ind w:start="720" w:hanging="360"/>
+      </w:pPr>
+      <w:rPr/>
+    </w:lvl>
+    <w:lvl w:ilvl="1">
+      <w:start w:val="1"/>
+      <w:numFmt w:val="decimal"/>
+      <w:lvlText w:val="%2."/>
+      <w:lvlJc w:val="start"/>
+      <w:pPr>
+        <w:tabs>
+          <w:tab w:val="num" w:pos="1080"/>
+        </w:tabs>
+        <w:ind w:start="1080" w:hanging="360"/>
+      </w:pPr>
+      <w:rPr/>
+    </w:lvl>
+    <w:lvl w:ilvl="2">
+      <w:start w:val="1"/>
+      <w:numFmt w:val="decimal"/>
+      <w:lvlText w:val="%3."/>
+      <w:lvlJc w:val="start"/>
+      <w:pPr>
+        <w:tabs>
+          <w:tab w:val="num" w:pos="1440"/>
+        </w:tabs>
+        <w:ind w:start="1440" w:hanging="360"/>
+      </w:pPr>
+      <w:rPr/>
+    </w:lvl>
+    <w:lvl w:ilvl="3">
+      <w:start w:val="1"/>
+      <w:numFmt w:val="decimal"/>
+      <w:lvlText w:val="%4."/>
+      <w:lvlJc w:val="start"/>
+      <w:pPr>
+        <w:tabs>
+          <w:tab w:val="num" w:pos="1800"/>
+        </w:tabs>
+        <w:ind w:start="1800" w:hanging="360"/>
+      </w:pPr>
+      <w:rPr/>
+    </w:lvl>
+    <w:lvl w:ilvl="4">
+      <w:start w:val="1"/>
+      <w:numFmt w:val="decimal"/>
+      <w:lvlText w:val="%5."/>
+      <w:lvlJc w:val="start"/>
+      <w:pPr>
+        <w:tabs>
+          <w:tab w:val="num" w:pos="2160"/>
+        </w:tabs>
+        <w:ind w:start="2160" w:hanging="360"/>
+      </w:pPr>
+      <w:rPr/>
+    </w:lvl>
+    <w:lvl w:ilvl="5">
+      <w:start w:val="1"/>
+      <w:numFmt w:val="decimal"/>
+      <w:lvlText w:val="%6."/>
+      <w:lvlJc w:val="start"/>
+      <w:pPr>
+        <w:tabs>
+          <w:tab w:val="num" w:pos="2520"/>
+        </w:tabs>
+        <w:ind w:start="2520" w:hanging="360"/>
+      </w:pPr>
+      <w:rPr/>
+    </w:lvl>
+    <w:lvl w:ilvl="6">
+      <w:start w:val="1"/>
+      <w:numFmt w:val="decimal"/>
+      <w:lvlText w:val="%7."/>
+      <w:lvlJc w:val="start"/>
+      <w:pPr>
+        <w:tabs>
+          <w:tab w:val="num" w:pos="2880"/>
+        </w:tabs>
+        <w:ind w:start="2880" w:hanging="360"/>
+      </w:pPr>
+      <w:rPr/>
+    </w:lvl>
+    <w:lvl w:ilvl="7">
+      <w:start w:val="1"/>
+      <w:numFmt w:val="decimal"/>
+      <w:lvlText w:val="%8."/>
+      <w:lvlJc w:val="start"/>
+      <w:pPr>
+        <w:tabs>
+          <w:tab w:val="num" w:pos="3240"/>
+        </w:tabs>
+        <w:ind w:start="3240" w:hanging="360"/>
+      </w:pPr>
+      <w:rPr/>
+    </w:lvl>
+    <w:lvl w:ilvl="8">
+      <w:start w:val="1"/>
+      <w:numFmt w:val="decimal"/>
+      <w:lvlText w:val="%9."/>
+      <w:lvlJc w:val="start"/>
+      <w:pPr>
+        <w:tabs>
+          <w:tab w:val="num" w:pos="3600"/>
+        </w:tabs>
+        <w:ind w:start="3600" w:hanging="360"/>
+      </w:pPr>
+      <w:rPr/>
+    </w:lvl>
+  </w:abstractNum>
+  <w:abstractNum w:abstractNumId="5">
+    <w:lvl w:ilvl="0">
+      <w:start w:val="1"/>
+      <w:numFmt w:val="none"/>
+      <w:suff w:val="nothing"/>
+      <w:lvlText w:val=""/>
+      <w:lvlJc w:val="start"/>
+      <w:pPr>
+        <w:tabs>
+          <w:tab w:val="num" w:pos="0"/>
+        </w:tabs>
+        <w:ind w:start="0" w:hanging="0"/>
+      </w:pPr>
+    </w:lvl>
+    <w:lvl w:ilvl="1">
+      <w:start w:val="1"/>
+      <w:numFmt w:val="none"/>
+      <w:suff w:val="nothing"/>
+      <w:lvlText w:val=""/>
+      <w:lvlJc w:val="start"/>
+      <w:pPr>
+        <w:tabs>
+          <w:tab w:val="num" w:pos="0"/>
+        </w:tabs>
+        <w:ind w:start="0" w:hanging="0"/>
+      </w:pPr>
+    </w:lvl>
+    <w:lvl w:ilvl="2">
+      <w:start w:val="1"/>
+      <w:numFmt w:val="none"/>
+      <w:suff w:val="nothing"/>
+      <w:lvlText w:val=""/>
+      <w:lvlJc w:val="start"/>
+      <w:pPr>
+        <w:tabs>
+          <w:tab w:val="num" w:pos="0"/>
+        </w:tabs>
+        <w:ind w:start="0" w:hanging="0"/>
+      </w:pPr>
+    </w:lvl>
+    <w:lvl w:ilvl="3">
+      <w:start w:val="1"/>
+      <w:numFmt w:val="none"/>
+      <w:suff w:val="nothing"/>
+      <w:lvlText w:val=""/>
+      <w:lvlJc w:val="start"/>
+      <w:pPr>
+        <w:tabs>
+          <w:tab w:val="num" w:pos="0"/>
+        </w:tabs>
+        <w:ind w:start="0" w:hanging="0"/>
+      </w:pPr>
+    </w:lvl>
+    <w:lvl w:ilvl="4">
+      <w:start w:val="1"/>
+      <w:numFmt w:val="none"/>
+      <w:suff w:val="nothing"/>
+      <w:lvlText w:val=""/>
+      <w:lvlJc w:val="start"/>
+      <w:pPr>
+        <w:tabs>
+          <w:tab w:val="num" w:pos="0"/>
+        </w:tabs>
+        <w:ind w:start="0" w:hanging="0"/>
+      </w:pPr>
+    </w:lvl>
+    <w:lvl w:ilvl="5">
+      <w:start w:val="1"/>
+      <w:numFmt w:val="none"/>
+      <w:suff w:val="nothing"/>
+      <w:lvlText w:val=""/>
+      <w:lvlJc w:val="start"/>
+      <w:pPr>
+        <w:tabs>
+          <w:tab w:val="num" w:pos="0"/>
+        </w:tabs>
+        <w:ind w:start="0" w:hanging="0"/>
+      </w:pPr>
+    </w:lvl>
+    <w:lvl w:ilvl="6">
+      <w:start w:val="1"/>
+      <w:numFmt w:val="none"/>
+      <w:suff w:val="nothing"/>
+      <w:lvlText w:val=""/>
+      <w:lvlJc w:val="start"/>
+      <w:pPr>
+        <w:tabs>
+          <w:tab w:val="num" w:pos="0"/>
+        </w:tabs>
+        <w:ind w:start="0" w:hanging="0"/>
+      </w:pPr>
+    </w:lvl>
+    <w:lvl w:ilvl="7">
+      <w:start w:val="1"/>
+      <w:numFmt w:val="none"/>
+      <w:suff w:val="nothing"/>
+      <w:lvlText w:val=""/>
+      <w:lvlJc w:val="start"/>
+      <w:pPr>
+        <w:tabs>
+          <w:tab w:val="num" w:pos="0"/>
+        </w:tabs>
+        <w:ind w:start="0" w:hanging="0"/>
+      </w:pPr>
+    </w:lvl>
+    <w:lvl w:ilvl="8">
+      <w:start w:val="1"/>
+      <w:numFmt w:val="none"/>
+      <w:suff w:val="nothing"/>
+      <w:lvlText w:val=""/>
+      <w:lvlJc w:val="start"/>
+      <w:pPr>
+        <w:tabs>
+          <w:tab w:val="num" w:pos="0"/>
+        </w:tabs>
+        <w:ind w:start="0" w:hanging="0"/>
+      </w:pPr>
+    </w:lvl>
+  </w:abstractNum>
+  <w:num w:numId="1">
+    <w:abstractNumId w:val="1"/>
+  </w:num>
+  <w:num w:numId="2">
+    <w:abstractNumId w:val="2"/>
+  </w:num>
+  <w:num w:numId="3">
+    <w:abstractNumId w:val="3"/>
+  </w:num>
+  <w:num w:numId="4">
+    <w:abstractNumId w:val="4"/>
+  </w:num>
+  <w:num w:numId="5">
+    <w:abstractNumId w:val="5"/>
+  </w:num>
+</w:numbering>
 </file>
 
 <file path=word/styles.xml><?xml version="1.0" encoding="utf-8"?>
@@ -159,7 +1111,6 @@
     </w:rPrDefault>
     <w:pPrDefault>
       <w:pPr>
-        <w:widowControl/>
         <w:suppressAutoHyphens w:val="true"/>
       </w:pPr>
     </w:pPrDefault>
@@ -169,10 +1120,11 @@
     <w:qFormat/>
     <w:pPr>
       <w:widowControl/>
-      <w:kinsoku w:val="true"/>
+      <w:suppressAutoHyphens w:val="true"/>
       <w:overflowPunct w:val="true"/>
-      <w:autoSpaceDE w:val="true"/>
       <w:bidi w:val="0"/>
+      <w:spacing w:before="0" w:after="0"/>
+      <w:jc w:val="start"/>
     </w:pPr>
     <w:rPr>
       <w:rFonts w:ascii="Liberation Serif" w:hAnsi="Liberation Serif" w:eastAsia="Noto Serif CJK SC" w:cs="Noto Sans Devanagari"/>
@@ -182,6 +1134,18 @@
       <w:szCs w:val="24"/>
       <w:lang w:val="pt-BR" w:eastAsia="zh-CN" w:bidi="hi-IN"/>
     </w:rPr>
+  </w:style>
+  <w:style w:type="character" w:styleId="Marcadores">
+    <w:name w:val="Marcadores"/>
+    <w:qFormat/>
+    <w:rPr>
+      <w:rFonts w:ascii="OpenSymbol" w:hAnsi="OpenSymbol" w:eastAsia="OpenSymbol" w:cs="OpenSymbol"/>
+    </w:rPr>
+  </w:style>
+  <w:style w:type="character" w:styleId="Smbolosdenumerao">
+    <w:name w:val="Símbolos de numeração"/>
+    <w:qFormat/>
+    <w:rPr/>
   </w:style>
   <w:style w:type="paragraph" w:styleId="Ttulo">
     <w:name w:val="Título"/>

</xml_diff>